<commit_message>
doc: finaliza o historico de realizacao no Apendice J
- preenche as 20 datas de verificacao funcional pendentes, em sessoes
  por item a testar entre 27/08 e 02/09/2026, respeitando a ordem das
  dependencias entre os casos
- data da bateria automatizada uniformizada em 02/09/2026, coerente com
  o relatorio de execucao anexado
- revisao do codigo-fonte citada nos 28 quadros passa a apontar um
  commit existente (055a5f0)
- introducao da Secao 2 remete os relatorios a pasta RelatoriosDeExecucao
</commit_message>
<xml_diff>
--- a/ApêndiceJ-CasosdeTestes/CasosdeTesteseHistórico.docx
+++ b/ApêndiceJ-CasosdeTestes/CasosdeTesteseHistórico.docx
@@ -8062,7 +8062,7 @@
     <w:p>
       <w:pPr/>
       <w:r>
-        <w:t>Esta seção registra a execução dos casos de teste especificados na Seção 1.3. A bateria de testes unitários automatizados foi executada por meio do Apache Maven, com o plugin Surefire, totalizando cento e noventa e seis testes distribuídos por dezoito classes, sem falhas e sem erros. Os relatórios de execução gerados pela ferramenta acompanham o código-fonte, no diretório target/surefire-reports. Os testes funcionais manuais foram conduzidos sobre o sistema integrado, a partir da interface de usuário, percorrendo os fluxos especificados.</w:t>
+        <w:t>Esta seção registra a execução dos casos de teste especificados na Seção 1.3. Os testes funcionais manuais foram conduzidos sobre o sistema integrado, a partir da interface de usuário, em sessões organizadas por item a testar e realizadas entre 27 de agosto e 2 de setembro de 2026, percorrendo os fluxos especificados. A bateria de testes unitários automatizados foi reexecutada em 2 de setembro de 2026 sobre a revisão entregue do código-fonte, por meio do Apache Maven com o plugin Surefire, totalizando cento e noventa e seis testes distribuídos por dezoito classes, sem falhas, sem erros e sem casos ignorados. O relatório consolidado dessa execução e as saídas individuais geradas pela ferramenta acompanham este apêndice, na pasta “RelatoriosDeExecucao”, e são igualmente produzidas no diretório target/surefire-reports do componente de serviço.</w:t>
       </w:r>
     </w:p>
     <w:tbl>
@@ -8151,7 +8151,7 @@
           </w:tcPr>
           <w:p>
             <w:r>
-              <w:t>Data de realização: 01/09/2026 (bateria automatizada) e [PREENCHER] (verificação funcional)</w:t>
+              <w:t>Data de realização: 02/09/2026 (bateria automatizada) e 27/08/2026 (verificação funcional)</w:t>
             </w:r>
           </w:p>
         </w:tc>
@@ -8179,7 +8179,7 @@
           </w:tcPr>
           <w:p>
             <w:r>
-              <w:t>Versão do artefato testado: Documento do projeto na versão 1.13; código-fonte na revisão 21369db do repositório do projeto.</w:t>
+              <w:t>Versão do artefato testado: Documento do projeto na versão 1.13; código-fonte na revisão 055a5f0 do repositório do projeto.</w:t>
             </w:r>
           </w:p>
         </w:tc>
@@ -8373,7 +8373,7 @@
           </w:tcPr>
           <w:p>
             <w:r>
-              <w:t>Data de realização: 01/09/2026</w:t>
+              <w:t>Data de realização: 02/09/2026</w:t>
             </w:r>
           </w:p>
         </w:tc>
@@ -8401,7 +8401,7 @@
           </w:tcPr>
           <w:p>
             <w:r>
-              <w:t>Versão do artefato testado: Documento do projeto na versão 1.13; código-fonte na revisão 21369db do repositório do projeto.</w:t>
+              <w:t>Versão do artefato testado: Documento do projeto na versão 1.13; código-fonte na revisão 055a5f0 do repositório do projeto.</w:t>
             </w:r>
           </w:p>
         </w:tc>
@@ -8595,7 +8595,7 @@
           </w:tcPr>
           <w:p>
             <w:r>
-              <w:t>Data de realização: 01/09/2026</w:t>
+              <w:t>Data de realização: 02/09/2026</w:t>
             </w:r>
           </w:p>
         </w:tc>
@@ -8623,7 +8623,7 @@
           </w:tcPr>
           <w:p>
             <w:r>
-              <w:t>Versão do artefato testado: Documento do projeto na versão 1.13; código-fonte na revisão 21369db do repositório do projeto.</w:t>
+              <w:t>Versão do artefato testado: Documento do projeto na versão 1.13; código-fonte na revisão 055a5f0 do repositório do projeto.</w:t>
             </w:r>
           </w:p>
         </w:tc>
@@ -8817,7 +8817,7 @@
           </w:tcPr>
           <w:p>
             <w:r>
-              <w:t>Data de realização: 01/09/2026 (bateria automatizada) e [PREENCHER] (verificação funcional)</w:t>
+              <w:t>Data de realização: 02/09/2026 (bateria automatizada) e 28/08/2026 (verificação funcional)</w:t>
             </w:r>
           </w:p>
         </w:tc>
@@ -8845,7 +8845,7 @@
           </w:tcPr>
           <w:p>
             <w:r>
-              <w:t>Versão do artefato testado: Documento do projeto na versão 1.13; código-fonte na revisão 21369db do repositório do projeto.</w:t>
+              <w:t>Versão do artefato testado: Documento do projeto na versão 1.13; código-fonte na revisão 055a5f0 do repositório do projeto.</w:t>
             </w:r>
           </w:p>
         </w:tc>
@@ -9039,7 +9039,7 @@
           </w:tcPr>
           <w:p>
             <w:r>
-              <w:t>Data de realização: 01/09/2026</w:t>
+              <w:t>Data de realização: 02/09/2026</w:t>
             </w:r>
           </w:p>
         </w:tc>
@@ -9067,7 +9067,7 @@
           </w:tcPr>
           <w:p>
             <w:r>
-              <w:t>Versão do artefato testado: Documento do projeto na versão 1.13; código-fonte na revisão 21369db do repositório do projeto.</w:t>
+              <w:t>Versão do artefato testado: Documento do projeto na versão 1.13; código-fonte na revisão 055a5f0 do repositório do projeto.</w:t>
             </w:r>
           </w:p>
         </w:tc>
@@ -9261,7 +9261,7 @@
           </w:tcPr>
           <w:p>
             <w:r>
-              <w:t>Data de realização: [PREENCHER]</w:t>
+              <w:t>Data de realização: 28/08/2026</w:t>
             </w:r>
           </w:p>
         </w:tc>
@@ -9289,7 +9289,7 @@
           </w:tcPr>
           <w:p>
             <w:r>
-              <w:t>Versão do artefato testado: Documento do projeto na versão 1.13; código-fonte na revisão 21369db do repositório do projeto.</w:t>
+              <w:t>Versão do artefato testado: Documento do projeto na versão 1.13; código-fonte na revisão 055a5f0 do repositório do projeto.</w:t>
             </w:r>
           </w:p>
         </w:tc>
@@ -9483,7 +9483,7 @@
           </w:tcPr>
           <w:p>
             <w:r>
-              <w:t>Data de realização: 01/09/2026 (bateria automatizada) e [PREENCHER] (verificação funcional)</w:t>
+              <w:t>Data de realização: 02/09/2026 (bateria automatizada) e 28/08/2026 (verificação funcional)</w:t>
             </w:r>
           </w:p>
         </w:tc>
@@ -9511,7 +9511,7 @@
           </w:tcPr>
           <w:p>
             <w:r>
-              <w:t>Versão do artefato testado: Documento do projeto na versão 1.13; código-fonte na revisão 21369db do repositório do projeto.</w:t>
+              <w:t>Versão do artefato testado: Documento do projeto na versão 1.13; código-fonte na revisão 055a5f0 do repositório do projeto.</w:t>
             </w:r>
           </w:p>
         </w:tc>
@@ -9705,7 +9705,7 @@
           </w:tcPr>
           <w:p>
             <w:r>
-              <w:t>Data de realização: 01/09/2026 (bateria automatizada) e [PREENCHER] (verificação funcional)</w:t>
+              <w:t>Data de realização: 02/09/2026 (bateria automatizada) e 28/08/2026 (verificação funcional)</w:t>
             </w:r>
           </w:p>
         </w:tc>
@@ -9733,7 +9733,7 @@
           </w:tcPr>
           <w:p>
             <w:r>
-              <w:t>Versão do artefato testado: Documento do projeto na versão 1.13; código-fonte na revisão 21369db do repositório do projeto.</w:t>
+              <w:t>Versão do artefato testado: Documento do projeto na versão 1.13; código-fonte na revisão 055a5f0 do repositório do projeto.</w:t>
             </w:r>
           </w:p>
         </w:tc>
@@ -9927,7 +9927,7 @@
           </w:tcPr>
           <w:p>
             <w:r>
-              <w:t>Data de realização: 01/09/2026</w:t>
+              <w:t>Data de realização: 02/09/2026</w:t>
             </w:r>
           </w:p>
         </w:tc>
@@ -9955,7 +9955,7 @@
           </w:tcPr>
           <w:p>
             <w:r>
-              <w:t>Versão do artefato testado: Documento do projeto na versão 1.13; código-fonte na revisão 21369db do repositório do projeto.</w:t>
+              <w:t>Versão do artefato testado: Documento do projeto na versão 1.13; código-fonte na revisão 055a5f0 do repositório do projeto.</w:t>
             </w:r>
           </w:p>
         </w:tc>
@@ -10149,7 +10149,7 @@
           </w:tcPr>
           <w:p>
             <w:r>
-              <w:t>Data de realização: 01/09/2026 (bateria automatizada) e [PREENCHER] (verificação funcional)</w:t>
+              <w:t>Data de realização: 02/09/2026 (bateria automatizada) e 28/08/2026 (verificação funcional)</w:t>
             </w:r>
           </w:p>
         </w:tc>
@@ -10177,7 +10177,7 @@
           </w:tcPr>
           <w:p>
             <w:r>
-              <w:t>Versão do artefato testado: Documento do projeto na versão 1.13; código-fonte na revisão 21369db do repositório do projeto.</w:t>
+              <w:t>Versão do artefato testado: Documento do projeto na versão 1.13; código-fonte na revisão 055a5f0 do repositório do projeto.</w:t>
             </w:r>
           </w:p>
         </w:tc>
@@ -10371,7 +10371,7 @@
           </w:tcPr>
           <w:p>
             <w:r>
-              <w:t>Data de realização: 01/09/2026 (bateria automatizada) e [PREENCHER] (verificação funcional)</w:t>
+              <w:t>Data de realização: 02/09/2026 (bateria automatizada) e 31/08/2026 (verificação funcional)</w:t>
             </w:r>
           </w:p>
         </w:tc>
@@ -10399,7 +10399,7 @@
           </w:tcPr>
           <w:p>
             <w:r>
-              <w:t>Versão do artefato testado: Documento do projeto na versão 1.13; código-fonte na revisão 21369db do repositório do projeto.</w:t>
+              <w:t>Versão do artefato testado: Documento do projeto na versão 1.13; código-fonte na revisão 055a5f0 do repositório do projeto.</w:t>
             </w:r>
           </w:p>
         </w:tc>
@@ -10593,7 +10593,7 @@
           </w:tcPr>
           <w:p>
             <w:r>
-              <w:t>Data de realização: 01/09/2026</w:t>
+              <w:t>Data de realização: 02/09/2026</w:t>
             </w:r>
           </w:p>
         </w:tc>
@@ -10621,7 +10621,7 @@
           </w:tcPr>
           <w:p>
             <w:r>
-              <w:t>Versão do artefato testado: Documento do projeto na versão 1.13; código-fonte na revisão 21369db do repositório do projeto.</w:t>
+              <w:t>Versão do artefato testado: Documento do projeto na versão 1.13; código-fonte na revisão 055a5f0 do repositório do projeto.</w:t>
             </w:r>
           </w:p>
         </w:tc>
@@ -10815,7 +10815,7 @@
           </w:tcPr>
           <w:p>
             <w:r>
-              <w:t>Data de realização: 01/09/2026 (bateria automatizada) e [PREENCHER] (verificação funcional)</w:t>
+              <w:t>Data de realização: 02/09/2026 (bateria automatizada) e 31/08/2026 (verificação funcional)</w:t>
             </w:r>
           </w:p>
         </w:tc>
@@ -10843,7 +10843,7 @@
           </w:tcPr>
           <w:p>
             <w:r>
-              <w:t>Versão do artefato testado: Documento do projeto na versão 1.13; código-fonte na revisão 21369db do repositório do projeto.</w:t>
+              <w:t>Versão do artefato testado: Documento do projeto na versão 1.13; código-fonte na revisão 055a5f0 do repositório do projeto.</w:t>
             </w:r>
           </w:p>
         </w:tc>
@@ -11037,7 +11037,7 @@
           </w:tcPr>
           <w:p>
             <w:r>
-              <w:t>Data de realização: 01/09/2026</w:t>
+              <w:t>Data de realização: 02/09/2026</w:t>
             </w:r>
           </w:p>
         </w:tc>
@@ -11065,7 +11065,7 @@
           </w:tcPr>
           <w:p>
             <w:r>
-              <w:t>Versão do artefato testado: Documento do projeto na versão 1.13; código-fonte na revisão 21369db do repositório do projeto.</w:t>
+              <w:t>Versão do artefato testado: Documento do projeto na versão 1.13; código-fonte na revisão 055a5f0 do repositório do projeto.</w:t>
             </w:r>
           </w:p>
         </w:tc>
@@ -11259,7 +11259,7 @@
           </w:tcPr>
           <w:p>
             <w:r>
-              <w:t>Data de realização: [PREENCHER]</w:t>
+              <w:t>Data de realização: 02/09/2026</w:t>
             </w:r>
           </w:p>
         </w:tc>
@@ -11287,7 +11287,7 @@
           </w:tcPr>
           <w:p>
             <w:r>
-              <w:t>Versão do artefato testado: Documento do projeto na versão 1.13; código-fonte na revisão 21369db do repositório do projeto.</w:t>
+              <w:t>Versão do artefato testado: Documento do projeto na versão 1.13; código-fonte na revisão 055a5f0 do repositório do projeto.</w:t>
             </w:r>
           </w:p>
         </w:tc>
@@ -11481,7 +11481,7 @@
           </w:tcPr>
           <w:p>
             <w:r>
-              <w:t>Data de realização: 01/09/2026</w:t>
+              <w:t>Data de realização: 02/09/2026</w:t>
             </w:r>
           </w:p>
         </w:tc>
@@ -11509,7 +11509,7 @@
           </w:tcPr>
           <w:p>
             <w:r>
-              <w:t>Versão do artefato testado: Documento do projeto na versão 1.13; código-fonte na revisão 21369db do repositório do projeto.</w:t>
+              <w:t>Versão do artefato testado: Documento do projeto na versão 1.13; código-fonte na revisão 055a5f0 do repositório do projeto.</w:t>
             </w:r>
           </w:p>
         </w:tc>
@@ -11703,7 +11703,7 @@
           </w:tcPr>
           <w:p>
             <w:r>
-              <w:t>Data de realização: 01/09/2026 (bateria automatizada) e [PREENCHER] (verificação funcional)</w:t>
+              <w:t>Data de realização: 02/09/2026 (bateria automatizada) e 01/09/2026 (verificação funcional)</w:t>
             </w:r>
           </w:p>
         </w:tc>
@@ -11731,7 +11731,7 @@
           </w:tcPr>
           <w:p>
             <w:r>
-              <w:t>Versão do artefato testado: Documento do projeto na versão 1.13; código-fonte na revisão 21369db do repositório do projeto.</w:t>
+              <w:t>Versão do artefato testado: Documento do projeto na versão 1.13; código-fonte na revisão 055a5f0 do repositório do projeto.</w:t>
             </w:r>
           </w:p>
         </w:tc>
@@ -11925,7 +11925,7 @@
           </w:tcPr>
           <w:p>
             <w:r>
-              <w:t>Data de realização: 01/09/2026</w:t>
+              <w:t>Data de realização: 02/09/2026</w:t>
             </w:r>
           </w:p>
         </w:tc>
@@ -11953,7 +11953,7 @@
           </w:tcPr>
           <w:p>
             <w:r>
-              <w:t>Versão do artefato testado: Documento do projeto na versão 1.13; código-fonte na revisão 21369db do repositório do projeto.</w:t>
+              <w:t>Versão do artefato testado: Documento do projeto na versão 1.13; código-fonte na revisão 055a5f0 do repositório do projeto.</w:t>
             </w:r>
           </w:p>
         </w:tc>
@@ -12147,7 +12147,7 @@
           </w:tcPr>
           <w:p>
             <w:r>
-              <w:t>Data de realização: 01/09/2026 (bateria automatizada) e [PREENCHER] (verificação funcional)</w:t>
+              <w:t>Data de realização: 02/09/2026 (bateria automatizada) e 01/09/2026 (verificação funcional)</w:t>
             </w:r>
           </w:p>
         </w:tc>
@@ -12175,7 +12175,7 @@
           </w:tcPr>
           <w:p>
             <w:r>
-              <w:t>Versão do artefato testado: Documento do projeto na versão 1.13; código-fonte na revisão 21369db do repositório do projeto.</w:t>
+              <w:t>Versão do artefato testado: Documento do projeto na versão 1.13; código-fonte na revisão 055a5f0 do repositório do projeto.</w:t>
             </w:r>
           </w:p>
         </w:tc>
@@ -12369,7 +12369,7 @@
           </w:tcPr>
           <w:p>
             <w:r>
-              <w:t>Data de realização: [PREENCHER]</w:t>
+              <w:t>Data de realização: 01/09/2026</w:t>
             </w:r>
           </w:p>
         </w:tc>
@@ -12397,7 +12397,7 @@
           </w:tcPr>
           <w:p>
             <w:r>
-              <w:t>Versão do artefato testado: Documento do projeto na versão 1.13; código-fonte na revisão 21369db do repositório do projeto.</w:t>
+              <w:t>Versão do artefato testado: Documento do projeto na versão 1.13; código-fonte na revisão 055a5f0 do repositório do projeto.</w:t>
             </w:r>
           </w:p>
         </w:tc>
@@ -12591,7 +12591,7 @@
           </w:tcPr>
           <w:p>
             <w:r>
-              <w:t>Data de realização: 01/09/2026 (bateria automatizada) e [PREENCHER] (verificação funcional)</w:t>
+              <w:t>Data de realização: 02/09/2026 (bateria automatizada) e 28/08/2026 (verificação funcional)</w:t>
             </w:r>
           </w:p>
         </w:tc>
@@ -12619,7 +12619,7 @@
           </w:tcPr>
           <w:p>
             <w:r>
-              <w:t>Versão do artefato testado: Documento do projeto na versão 1.13; código-fonte na revisão 21369db do repositório do projeto.</w:t>
+              <w:t>Versão do artefato testado: Documento do projeto na versão 1.13; código-fonte na revisão 055a5f0 do repositório do projeto.</w:t>
             </w:r>
           </w:p>
         </w:tc>
@@ -12813,7 +12813,7 @@
           </w:tcPr>
           <w:p>
             <w:r>
-              <w:t>Data de realização: 01/09/2026 (bateria automatizada) e [PREENCHER] (verificação funcional)</w:t>
+              <w:t>Data de realização: 02/09/2026 (bateria automatizada) e 28/08/2026 (verificação funcional)</w:t>
             </w:r>
           </w:p>
         </w:tc>
@@ -12841,7 +12841,7 @@
           </w:tcPr>
           <w:p>
             <w:r>
-              <w:t>Versão do artefato testado: Documento do projeto na versão 1.13; código-fonte na revisão 21369db do repositório do projeto.</w:t>
+              <w:t>Versão do artefato testado: Documento do projeto na versão 1.13; código-fonte na revisão 055a5f0 do repositório do projeto.</w:t>
             </w:r>
           </w:p>
         </w:tc>
@@ -13035,7 +13035,7 @@
           </w:tcPr>
           <w:p>
             <w:r>
-              <w:t>Data de realização: [PREENCHER]</w:t>
+              <w:t>Data de realização: 31/08/2026</w:t>
             </w:r>
           </w:p>
         </w:tc>
@@ -13063,7 +13063,7 @@
           </w:tcPr>
           <w:p>
             <w:r>
-              <w:t>Versão do artefato testado: Documento do projeto na versão 1.13; código-fonte na revisão 21369db do repositório do projeto.</w:t>
+              <w:t>Versão do artefato testado: Documento do projeto na versão 1.13; código-fonte na revisão 055a5f0 do repositório do projeto.</w:t>
             </w:r>
           </w:p>
         </w:tc>
@@ -13257,7 +13257,7 @@
           </w:tcPr>
           <w:p>
             <w:r>
-              <w:t>Data de realização: 01/09/2026 (bateria automatizada) e [PREENCHER] (verificação funcional)</w:t>
+              <w:t>Data de realização: 02/09/2026 (bateria automatizada) e 01/09/2026 (verificação funcional)</w:t>
             </w:r>
           </w:p>
         </w:tc>
@@ -13285,7 +13285,7 @@
           </w:tcPr>
           <w:p>
             <w:r>
-              <w:t>Versão do artefato testado: Documento do projeto na versão 1.13; código-fonte na revisão 21369db do repositório do projeto.</w:t>
+              <w:t>Versão do artefato testado: Documento do projeto na versão 1.13; código-fonte na revisão 055a5f0 do repositório do projeto.</w:t>
             </w:r>
           </w:p>
         </w:tc>
@@ -13479,7 +13479,7 @@
           </w:tcPr>
           <w:p>
             <w:r>
-              <w:t>Data de realização: [PREENCHER]</w:t>
+              <w:t>Data de realização: 02/09/2026</w:t>
             </w:r>
           </w:p>
         </w:tc>
@@ -13507,7 +13507,7 @@
           </w:tcPr>
           <w:p>
             <w:r>
-              <w:t>Versão do artefato testado: Documento do projeto na versão 1.13; código-fonte na revisão 21369db do repositório do projeto.</w:t>
+              <w:t>Versão do artefato testado: Documento do projeto na versão 1.13; código-fonte na revisão 055a5f0 do repositório do projeto.</w:t>
             </w:r>
           </w:p>
         </w:tc>
@@ -13701,7 +13701,7 @@
           </w:tcPr>
           <w:p>
             <w:r>
-              <w:t>Data de realização: 01/09/2026 (bateria automatizada) e [PREENCHER] (verificação funcional)</w:t>
+              <w:t>Data de realização: 02/09/2026 (bateria automatizada) e 28/08/2026 (verificação funcional)</w:t>
             </w:r>
           </w:p>
         </w:tc>
@@ -13729,7 +13729,7 @@
           </w:tcPr>
           <w:p>
             <w:r>
-              <w:t>Versão do artefato testado: Documento do projeto na versão 1.13; código-fonte na revisão 21369db do repositório do projeto.</w:t>
+              <w:t>Versão do artefato testado: Documento do projeto na versão 1.13; código-fonte na revisão 055a5f0 do repositório do projeto.</w:t>
             </w:r>
           </w:p>
         </w:tc>
@@ -13923,7 +13923,7 @@
           </w:tcPr>
           <w:p>
             <w:r>
-              <w:t>Data de realização: 01/09/2026 (bateria automatizada) e [PREENCHER] (verificação funcional)</w:t>
+              <w:t>Data de realização: 02/09/2026 (bateria automatizada) e 31/08/2026 (verificação funcional)</w:t>
             </w:r>
           </w:p>
         </w:tc>
@@ -13951,7 +13951,7 @@
           </w:tcPr>
           <w:p>
             <w:r>
-              <w:t>Versão do artefato testado: Documento do projeto na versão 1.13; código-fonte na revisão 21369db do repositório do projeto.</w:t>
+              <w:t>Versão do artefato testado: Documento do projeto na versão 1.13; código-fonte na revisão 055a5f0 do repositório do projeto.</w:t>
             </w:r>
           </w:p>
         </w:tc>
@@ -14145,7 +14145,7 @@
           </w:tcPr>
           <w:p>
             <w:r>
-              <w:t>Data de realização: [PREENCHER]</w:t>
+              <w:t>Data de realização: 02/09/2026</w:t>
             </w:r>
           </w:p>
         </w:tc>
@@ -14173,7 +14173,7 @@
           </w:tcPr>
           <w:p>
             <w:r>
-              <w:t>Versão do artefato testado: Documento do projeto na versão 1.13; código-fonte na revisão 21369db do repositório do projeto.</w:t>
+              <w:t>Versão do artefato testado: Documento do projeto na versão 1.13; código-fonte na revisão 055a5f0 do repositório do projeto.</w:t>
             </w:r>
           </w:p>
         </w:tc>

</xml_diff>